<commit_message>
Tarea acceso a datos revisada y terminada
</commit_message>
<xml_diff>
--- a/Acc_Datos/RA1_A1_AcesoDatos.docx
+++ b/Acc_Datos/RA1_A1_AcesoDatos.docx
@@ -1109,20 +1109,7 @@
           <w:lang w:eastAsia="es-ES"/>
           <w14:ligatures w14:val="none"/>
         </w:rPr>
-        <w:t xml:space="preserve">1. </w:t>
-      </w:r>
-      <w:r>
-        <w:rPr>
-          <w:rFonts w:eastAsia="Times New Roman" w:cs="Calibri" w:ascii="Times New Roman" w:hAnsi="Times New Roman"/>
-          <w:b/>
-          <w:bCs/>
-          <w:kern w:val="0"/>
-          <w:sz w:val="24"/>
-          <w:szCs w:val="24"/>
-          <w:lang w:eastAsia="es-ES"/>
-          <w14:ligatures w14:val="none"/>
-        </w:rPr>
-        <w:t>Estrategias de acceso a datos</w:t>
+        <w:t>1. Estrategias de acceso a datos</w:t>
       </w:r>
     </w:p>
     <w:p>
@@ -1347,20 +1334,7 @@
           <w:lang w:eastAsia="es-ES"/>
           <w14:ligatures w14:val="none"/>
         </w:rPr>
-        <w:t xml:space="preserve">2. </w:t>
-      </w:r>
-      <w:r>
-        <w:rPr>
-          <w:rFonts w:eastAsia="Times New Roman" w:cs="Calibri" w:ascii="Times New Roman" w:hAnsi="Times New Roman"/>
-          <w:b/>
-          <w:bCs/>
-          <w:kern w:val="0"/>
-          <w:sz w:val="24"/>
-          <w:szCs w:val="24"/>
-          <w:lang w:eastAsia="es-ES"/>
-          <w14:ligatures w14:val="none"/>
-        </w:rPr>
-        <w:t>Ventajas de las Bases de Datos frente a los ficheros</w:t>
+        <w:t>2. Ventajas de las Bases de Datos frente a los ficheros</w:t>
       </w:r>
     </w:p>
     <w:p>
@@ -1585,20 +1559,7 @@
           <w:lang w:eastAsia="es-ES"/>
           <w14:ligatures w14:val="none"/>
         </w:rPr>
-        <w:t xml:space="preserve">3. </w:t>
-      </w:r>
-      <w:r>
-        <w:rPr>
-          <w:rFonts w:eastAsia="Times New Roman" w:cs="Calibri" w:ascii="Times New Roman" w:hAnsi="Times New Roman"/>
-          <w:b/>
-          <w:bCs/>
-          <w:kern w:val="0"/>
-          <w:sz w:val="24"/>
-          <w:szCs w:val="24"/>
-          <w:lang w:eastAsia="es-ES"/>
-          <w14:ligatures w14:val="none"/>
-        </w:rPr>
-        <w:t>¿Existe un método de acceso a datos categóricamente superior?</w:t>
+        <w:t>3. ¿Existe un método de acceso a datos categóricamente superior?</w:t>
       </w:r>
     </w:p>
     <w:p>
@@ -1836,20 +1797,7 @@
           <w:lang w:eastAsia="es-ES"/>
           <w14:ligatures w14:val="none"/>
         </w:rPr>
-        <w:t xml:space="preserve">4. </w:t>
-      </w:r>
-      <w:r>
-        <w:rPr>
-          <w:rFonts w:eastAsia="Times New Roman" w:cs="Calibri" w:ascii="Times New Roman" w:hAnsi="Times New Roman"/>
-          <w:b/>
-          <w:bCs/>
-          <w:kern w:val="0"/>
-          <w:sz w:val="24"/>
-          <w:szCs w:val="24"/>
-          <w:lang w:eastAsia="es-ES"/>
-          <w14:ligatures w14:val="none"/>
-        </w:rPr>
-        <w:t>Desventajas del uso de ficheros para almacenar información</w:t>
+        <w:t>4. Desventajas del uso de ficheros para almacenar información</w:t>
       </w:r>
     </w:p>
     <w:p>
@@ -2140,20 +2088,7 @@
           <w:lang w:eastAsia="es-ES"/>
           <w14:ligatures w14:val="none"/>
         </w:rPr>
-        <w:t xml:space="preserve">5. </w:t>
-      </w:r>
-      <w:r>
-        <w:rPr>
-          <w:rFonts w:eastAsia="Times New Roman" w:cs="Calibri" w:ascii="Times New Roman" w:hAnsi="Times New Roman"/>
-          <w:b/>
-          <w:bCs/>
-          <w:kern w:val="0"/>
-          <w:sz w:val="24"/>
-          <w:szCs w:val="24"/>
-          <w:lang w:eastAsia="es-ES"/>
-          <w14:ligatures w14:val="none"/>
-        </w:rPr>
-        <w:t>Ficheros XML: definición y usos</w:t>
+        <w:t>5. Ficheros XML: definición y usos</w:t>
       </w:r>
     </w:p>
     <w:p>
@@ -2313,7 +2248,7 @@
       </w:r>
       <w:r>
         <w:rPr>
-          <w:rStyle w:val="Textooriginal"/>
+          <w:rStyle w:val="Textooriginaluser"/>
           <w:rFonts w:ascii="Times New Roman" w:hAnsi="Times New Roman"/>
           <w:b w:val="false"/>
           <w:bCs w:val="false"/>
@@ -2340,7 +2275,7 @@
       </w:r>
       <w:r>
         <w:rPr>
-          <w:rStyle w:val="Textooriginal"/>
+          <w:rStyle w:val="Textooriginaluser"/>
           <w:rFonts w:ascii="Times New Roman" w:hAnsi="Times New Roman"/>
           <w:b w:val="false"/>
           <w:bCs w:val="false"/>
@@ -2402,7 +2337,20 @@
           <w:lang w:eastAsia="es-ES"/>
           <w14:ligatures w14:val="none"/>
         </w:rPr>
-        <w:t>Estructuras de mensajería para servicios web tradicionales (protocolo SOAP).</w:t>
+        <w:t>Estructuras de mensajería para servicios web tradicionale</w:t>
+      </w:r>
+      <w:r>
+        <w:rPr>
+          <w:rFonts w:eastAsia="Times New Roman" w:cs="Calibri" w:ascii="Times New Roman" w:hAnsi="Times New Roman"/>
+          <w:b w:val="false"/>
+          <w:bCs w:val="false"/>
+          <w:kern w:val="0"/>
+          <w:sz w:val="20"/>
+          <w:szCs w:val="20"/>
+          <w:lang w:eastAsia="es-ES"/>
+          <w14:ligatures w14:val="none"/>
+        </w:rPr>
+        <w:t>s.</w:t>
       </w:r>
     </w:p>
     <w:p>
@@ -2471,20 +2419,7 @@
           <w:lang w:eastAsia="es-ES"/>
           <w14:ligatures w14:val="none"/>
         </w:rPr>
-        <w:t xml:space="preserve">6. </w:t>
-      </w:r>
-      <w:r>
-        <w:rPr>
-          <w:rFonts w:eastAsia="Times New Roman" w:cs="Calibri" w:ascii="Times New Roman" w:hAnsi="Times New Roman"/>
-          <w:b/>
-          <w:bCs/>
-          <w:kern w:val="0"/>
-          <w:sz w:val="24"/>
-          <w:szCs w:val="24"/>
-          <w:lang w:eastAsia="es-ES"/>
-          <w14:ligatures w14:val="none"/>
-        </w:rPr>
-        <w:t>Ventajas e inconvenientes de las Bases de Datos Relacionales (BDR)</w:t>
+        <w:t>6. Ventajas e inconvenientes de las Bases de Datos Relacionales (BDR)</w:t>
       </w:r>
     </w:p>
     <w:p>
@@ -2860,20 +2795,7 @@
           <w:lang w:eastAsia="es-ES"/>
           <w14:ligatures w14:val="none"/>
         </w:rPr>
-        <w:t xml:space="preserve">7. </w:t>
-      </w:r>
-      <w:r>
-        <w:rPr>
-          <w:rFonts w:eastAsia="Times New Roman" w:cs="Calibri" w:ascii="Times New Roman" w:hAnsi="Times New Roman"/>
-          <w:b/>
-          <w:bCs/>
-          <w:kern w:val="0"/>
-          <w:sz w:val="24"/>
-          <w:szCs w:val="24"/>
-          <w:lang w:eastAsia="es-ES"/>
-          <w14:ligatures w14:val="none"/>
-        </w:rPr>
-        <w:t>¿Por qué surgen las Bases de Datos Orientadas a Objetos (BDOO)?</w:t>
+        <w:t>7. ¿Por qué surgen las Bases de Datos Orientadas a Objetos (BDOO)?</w:t>
       </w:r>
     </w:p>
     <w:p>
@@ -3020,20 +2942,7 @@
           <w:lang w:eastAsia="es-ES"/>
           <w14:ligatures w14:val="none"/>
         </w:rPr>
-        <w:t xml:space="preserve">8. </w:t>
-      </w:r>
-      <w:r>
-        <w:rPr>
-          <w:rFonts w:eastAsia="Times New Roman" w:cs="Calibri" w:ascii="Calibri" w:hAnsi="Calibri"/>
-          <w:b/>
-          <w:bCs/>
-          <w:kern w:val="0"/>
-          <w:sz w:val="24"/>
-          <w:szCs w:val="24"/>
-          <w:lang w:eastAsia="es-ES"/>
-          <w14:ligatures w14:val="none"/>
-        </w:rPr>
-        <w:t xml:space="preserve">Comparativa: BDOO frente a BDR </w:t>
+        <w:t xml:space="preserve">8. Comparativa: BDOO frente a BDR </w:t>
       </w:r>
     </w:p>
     <w:p>
@@ -3099,7 +3008,7 @@
           </w:tcPr>
           <w:p>
             <w:pPr>
-              <w:pStyle w:val="Contenidodelatabla"/>
+              <w:pStyle w:val="Contenidodelatablauser"/>
               <w:spacing w:before="0" w:after="160"/>
               <w:jc w:val="center"/>
               <w:rPr>
@@ -3134,7 +3043,7 @@
           </w:tcPr>
           <w:p>
             <w:pPr>
-              <w:pStyle w:val="Contenidodelatabla"/>
+              <w:pStyle w:val="Contenidodelatablauser"/>
               <w:spacing w:before="0" w:after="160"/>
               <w:jc w:val="center"/>
               <w:rPr>
@@ -3169,7 +3078,7 @@
           </w:tcPr>
           <w:p>
             <w:pPr>
-              <w:pStyle w:val="Contenidodelatabla"/>
+              <w:pStyle w:val="Contenidodelatablauser"/>
               <w:spacing w:before="0" w:after="160"/>
               <w:jc w:val="center"/>
               <w:rPr>
@@ -3207,7 +3116,7 @@
           </w:tcPr>
           <w:p>
             <w:pPr>
-              <w:pStyle w:val="Contenidodelatabla"/>
+              <w:pStyle w:val="Contenidodelatablauser"/>
               <w:spacing w:before="0" w:after="160"/>
               <w:rPr>
                 <w:rFonts w:ascii="Times New Roman" w:hAnsi="Times New Roman"/>
@@ -3241,7 +3150,7 @@
           </w:tcPr>
           <w:p>
             <w:pPr>
-              <w:pStyle w:val="Contenidodelatabla"/>
+              <w:pStyle w:val="Contenidodelatablauser"/>
               <w:spacing w:before="0" w:after="160"/>
               <w:rPr>
                 <w:rFonts w:ascii="Times New Roman" w:hAnsi="Times New Roman"/>
@@ -3271,7 +3180,7 @@
           </w:tcPr>
           <w:p>
             <w:pPr>
-              <w:pStyle w:val="Contenidodelatabla"/>
+              <w:pStyle w:val="Contenidodelatablauser"/>
               <w:spacing w:before="0" w:after="160"/>
               <w:rPr>
                 <w:rFonts w:ascii="Times New Roman" w:hAnsi="Times New Roman"/>
@@ -3304,7 +3213,7 @@
           </w:tcPr>
           <w:p>
             <w:pPr>
-              <w:pStyle w:val="Contenidodelatabla"/>
+              <w:pStyle w:val="Contenidodelatablauser"/>
               <w:spacing w:before="0" w:after="160"/>
               <w:rPr>
                 <w:rFonts w:ascii="Times New Roman" w:hAnsi="Times New Roman"/>
@@ -3338,7 +3247,7 @@
           </w:tcPr>
           <w:p>
             <w:pPr>
-              <w:pStyle w:val="Contenidodelatabla"/>
+              <w:pStyle w:val="Contenidodelatablauser"/>
               <w:spacing w:before="0" w:after="160"/>
               <w:rPr>
                 <w:rFonts w:ascii="Times New Roman" w:hAnsi="Times New Roman"/>
@@ -3368,7 +3277,7 @@
           </w:tcPr>
           <w:p>
             <w:pPr>
-              <w:pStyle w:val="Contenidodelatabla"/>
+              <w:pStyle w:val="Contenidodelatablauser"/>
               <w:spacing w:before="0" w:after="160"/>
               <w:rPr>
                 <w:rFonts w:ascii="Times New Roman" w:hAnsi="Times New Roman"/>
@@ -3401,7 +3310,7 @@
           </w:tcPr>
           <w:p>
             <w:pPr>
-              <w:pStyle w:val="Contenidodelatabla"/>
+              <w:pStyle w:val="Contenidodelatablauser"/>
               <w:spacing w:before="0" w:after="160"/>
               <w:rPr>
                 <w:rFonts w:ascii="Times New Roman" w:hAnsi="Times New Roman"/>
@@ -3435,7 +3344,7 @@
           </w:tcPr>
           <w:p>
             <w:pPr>
-              <w:pStyle w:val="Contenidodelatabla"/>
+              <w:pStyle w:val="Contenidodelatablauser"/>
               <w:spacing w:before="0" w:after="160"/>
               <w:rPr>
                 <w:rFonts w:ascii="Times New Roman" w:hAnsi="Times New Roman"/>
@@ -3465,7 +3374,7 @@
           </w:tcPr>
           <w:p>
             <w:pPr>
-              <w:pStyle w:val="Contenidodelatabla"/>
+              <w:pStyle w:val="Contenidodelatablauser"/>
               <w:spacing w:before="0" w:after="160"/>
               <w:rPr>
                 <w:rFonts w:ascii="Times New Roman" w:hAnsi="Times New Roman"/>
@@ -3479,24 +3388,7 @@
                 <w:sz w:val="20"/>
                 <w:szCs w:val="20"/>
               </w:rPr>
-              <w:t>Se degrada si se requieren múltiples operaciones de unión (</w:t>
-            </w:r>
-            <w:r>
-              <w:rPr>
-                <w:rFonts w:ascii="Times New Roman" w:hAnsi="Times New Roman"/>
-                <w:i/>
-                <w:sz w:val="20"/>
-                <w:szCs w:val="20"/>
-              </w:rPr>
-              <w:t>joins</w:t>
-            </w:r>
-            <w:r>
-              <w:rPr>
-                <w:rFonts w:ascii="Times New Roman" w:hAnsi="Times New Roman"/>
-                <w:sz w:val="20"/>
-                <w:szCs w:val="20"/>
-              </w:rPr>
-              <w:t xml:space="preserve">) sucesivas. </w:t>
+              <w:t xml:space="preserve">Se degrada si se requieren múltiples operaciones de unión sucesivas. </w:t>
             </w:r>
           </w:p>
         </w:tc>
@@ -3515,7 +3407,7 @@
           </w:tcPr>
           <w:p>
             <w:pPr>
-              <w:pStyle w:val="Contenidodelatabla"/>
+              <w:pStyle w:val="Contenidodelatablauser"/>
               <w:spacing w:before="0" w:after="160"/>
               <w:rPr>
                 <w:rFonts w:ascii="Times New Roman" w:hAnsi="Times New Roman"/>
@@ -3549,7 +3441,7 @@
           </w:tcPr>
           <w:p>
             <w:pPr>
-              <w:pStyle w:val="Contenidodelatabla"/>
+              <w:pStyle w:val="Contenidodelatablauser"/>
               <w:spacing w:before="0" w:after="160"/>
               <w:rPr>
                 <w:rFonts w:ascii="Times New Roman" w:hAnsi="Times New Roman"/>
@@ -3563,7 +3455,7 @@
                 <w:sz w:val="20"/>
                 <w:szCs w:val="20"/>
               </w:rPr>
-              <w:t xml:space="preserve">Baja (intentos como ODMG tuvieron adopción limitada). </w:t>
+              <w:t>Baja.</w:t>
             </w:r>
           </w:p>
         </w:tc>
@@ -3579,7 +3471,7 @@
           </w:tcPr>
           <w:p>
             <w:pPr>
-              <w:pStyle w:val="Contenidodelatabla"/>
+              <w:pStyle w:val="Contenidodelatablauser"/>
               <w:spacing w:before="0" w:after="160"/>
               <w:rPr>
                 <w:rFonts w:ascii="Times New Roman" w:hAnsi="Times New Roman"/>
@@ -3612,7 +3504,7 @@
           </w:tcPr>
           <w:p>
             <w:pPr>
-              <w:pStyle w:val="Contenidodelatabla"/>
+              <w:pStyle w:val="Contenidodelatablauser"/>
               <w:spacing w:before="0" w:after="160"/>
               <w:rPr>
                 <w:rFonts w:ascii="Times New Roman" w:hAnsi="Times New Roman"/>
@@ -3646,7 +3538,7 @@
           </w:tcPr>
           <w:p>
             <w:pPr>
-              <w:pStyle w:val="Contenidodelatabla"/>
+              <w:pStyle w:val="Contenidodelatablauser"/>
               <w:spacing w:before="0" w:after="160"/>
               <w:rPr>
                 <w:rFonts w:ascii="Times New Roman" w:hAnsi="Times New Roman"/>
@@ -3676,7 +3568,7 @@
           </w:tcPr>
           <w:p>
             <w:pPr>
-              <w:pStyle w:val="Contenidodelatabla"/>
+              <w:pStyle w:val="Contenidodelatablauser"/>
               <w:spacing w:before="0" w:after="160"/>
               <w:rPr>
                 <w:rFonts w:ascii="Times New Roman" w:hAnsi="Times New Roman"/>
@@ -3709,7 +3601,7 @@
           </w:tcPr>
           <w:p>
             <w:pPr>
-              <w:pStyle w:val="Contenidodelatabla"/>
+              <w:pStyle w:val="Contenidodelatablauser"/>
               <w:spacing w:before="0" w:after="160"/>
               <w:rPr>
                 <w:rFonts w:ascii="Times New Roman" w:hAnsi="Times New Roman"/>
@@ -3743,7 +3635,7 @@
           </w:tcPr>
           <w:p>
             <w:pPr>
-              <w:pStyle w:val="Contenidodelatabla"/>
+              <w:pStyle w:val="Contenidodelatablauser"/>
               <w:spacing w:before="0" w:after="160"/>
               <w:rPr>
                 <w:rFonts w:ascii="Times New Roman" w:hAnsi="Times New Roman"/>
@@ -3773,7 +3665,7 @@
           </w:tcPr>
           <w:p>
             <w:pPr>
-              <w:pStyle w:val="Contenidodelatabla"/>
+              <w:pStyle w:val="Contenidodelatablauser"/>
               <w:spacing w:before="0" w:after="160"/>
               <w:rPr>
                 <w:rFonts w:ascii="Times New Roman" w:hAnsi="Times New Roman"/>
@@ -3853,20 +3745,7 @@
           <w:lang w:eastAsia="es-ES"/>
           <w14:ligatures w14:val="none"/>
         </w:rPr>
-        <w:t xml:space="preserve">9. </w:t>
-      </w:r>
-      <w:r>
-        <w:rPr>
-          <w:rFonts w:eastAsia="Times New Roman" w:cs="Calibri" w:ascii="Times New Roman" w:hAnsi="Times New Roman"/>
-          <w:b/>
-          <w:bCs/>
-          <w:kern w:val="0"/>
-          <w:sz w:val="24"/>
-          <w:szCs w:val="24"/>
-          <w:lang w:eastAsia="es-ES"/>
-          <w14:ligatures w14:val="none"/>
-        </w:rPr>
-        <w:t>¿Qué son las Bases de Datos Objeto-Relacionales (BDOR)?</w:t>
+        <w:t>9. ¿Qué son las Bases de Datos Objeto-Relacionales (BDOR)?</w:t>
       </w:r>
     </w:p>
     <w:p>
@@ -3896,7 +3775,7 @@
           <w:lang w:eastAsia="es-ES"/>
           <w14:ligatures w14:val="none"/>
         </w:rPr>
-        <w:t>Son una evolución de los sistemas relacionales tradicionales (SGBD) que extienden el modelo relacional incorporando características propias del paradigma orientado a objetos. Permiten seguir utilizando tablas, claves y SQL, pero añadiendo la capacidad de definir tipos de datos de usuario complejos (UDTs), herencia de tablas o tipos, métodos y referencias directas (ejemplos claros son PostgreSQL o las extensiones de Oracle).</w:t>
+        <w:t>Son una evolución de los sistemas relacionales tradicionales (SGBD) que extienden el modelo relacional incorporando características propias del paradigma orientado a objetos. Permiten seguir utilizando tablas, claves y SQL, pero añadiendo la capacidad de definir tipos de datos de usuario complejos (UDTs), herencia de tablas o tipos, métodos y referencias directas.</w:t>
       </w:r>
     </w:p>
     <w:p>
@@ -3928,20 +3807,7 @@
           <w:lang w:eastAsia="es-ES"/>
           <w14:ligatures w14:val="none"/>
         </w:rPr>
-        <w:t xml:space="preserve">10. </w:t>
-      </w:r>
-      <w:r>
-        <w:rPr>
-          <w:rFonts w:eastAsia="Times New Roman" w:cs="Calibri" w:ascii="Times New Roman" w:hAnsi="Times New Roman"/>
-          <w:b/>
-          <w:bCs/>
-          <w:kern w:val="0"/>
-          <w:sz w:val="24"/>
-          <w:szCs w:val="24"/>
-          <w:lang w:eastAsia="es-ES"/>
-          <w14:ligatures w14:val="none"/>
-        </w:rPr>
-        <w:t>Aportaciones de las BDOR respecto a las BDR tradicionales</w:t>
+        <w:t>10. Aportaciones de las BDOR respecto a las BDR tradicionales</w:t>
       </w:r>
     </w:p>
     <w:p>
@@ -7148,18 +7014,18 @@
       <w:szCs w:val="20"/>
     </w:rPr>
   </w:style>
-  <w:style w:type="character" w:styleId="Smbolosdenumeracin">
-    <w:name w:val="Símbolos de numeración"/>
+  <w:style w:type="character" w:styleId="Smbolosdenumeracinuser">
+    <w:name w:val="Símbolos de numeración (user)"/>
     <w:rPr/>
   </w:style>
-  <w:style w:type="character" w:styleId="Bolos">
-    <w:name w:val="Bolos"/>
+  <w:style w:type="character" w:styleId="Bolosuser">
+    <w:name w:val="Bolos (user)"/>
     <w:rPr>
       <w:rFonts w:ascii="OpenSymbol" w:hAnsi="OpenSymbol" w:eastAsia="OpenSymbol" w:cs="OpenSymbol"/>
     </w:rPr>
   </w:style>
-  <w:style w:type="character" w:styleId="Textooriginal">
-    <w:name w:val="Texto original"/>
+  <w:style w:type="character" w:styleId="Textooriginaluser">
+    <w:name w:val="Texto original (user)"/>
     <w:rPr>
       <w:rFonts w:ascii="Liberation Mono" w:hAnsi="Liberation Mono" w:eastAsia="Liberation Mono" w:cs="Liberation Mono"/>
     </w:rPr>
@@ -7334,14 +7200,14 @@
       <w:color w:themeColor="accent1" w:themeShade="bf" w:val="0F4761"/>
     </w:rPr>
   </w:style>
-  <w:style w:type="paragraph" w:styleId="Cabeceraypieuser">
-    <w:name w:val="Cabecera y pie (user)"/>
+  <w:style w:type="paragraph" w:styleId="Cabeceraypie">
+    <w:name w:val="Cabecera y pie"/>
     <w:basedOn w:val="Normal"/>
     <w:pPr/>
     <w:rPr/>
   </w:style>
-  <w:style w:type="paragraph" w:styleId="Cabeceraypie">
-    <w:name w:val="Cabecera y pie"/>
+  <w:style w:type="paragraph" w:styleId="Cabeceraypieuser">
+    <w:name w:val="Cabecera y pie (user)"/>
     <w:basedOn w:val="Normal"/>
     <w:pPr/>
     <w:rPr/>
@@ -7397,20 +7263,20 @@
       <w:szCs w:val="20"/>
     </w:rPr>
   </w:style>
+  <w:style w:type="paragraph" w:styleId="Contenidodelmarco">
+    <w:name w:val="Contenido del marco"/>
+    <w:basedOn w:val="Normal"/>
+    <w:pPr/>
+    <w:rPr/>
+  </w:style>
   <w:style w:type="paragraph" w:styleId="Contenidodelmarcouser">
     <w:name w:val="Contenido del marco (user)"/>
     <w:basedOn w:val="Normal"/>
     <w:pPr/>
     <w:rPr/>
   </w:style>
-  <w:style w:type="paragraph" w:styleId="Contenidodelmarco">
-    <w:name w:val="Contenido del marco"/>
-    <w:basedOn w:val="Normal"/>
-    <w:pPr/>
-    <w:rPr/>
-  </w:style>
-  <w:style w:type="paragraph" w:styleId="Contenidodelatabla">
-    <w:name w:val="Contenido de la tabla"/>
+  <w:style w:type="paragraph" w:styleId="Contenidodelatablauser">
+    <w:name w:val="Contenido de la tabla (user)"/>
     <w:basedOn w:val="Normal"/>
     <w:pPr>
       <w:widowControl w:val="false"/>
@@ -7418,9 +7284,9 @@
     </w:pPr>
     <w:rPr/>
   </w:style>
-  <w:style w:type="paragraph" w:styleId="Ttulodelatabla">
-    <w:name w:val="Título de la tabla"/>
-    <w:basedOn w:val="Contenidodelatabla"/>
+  <w:style w:type="paragraph" w:styleId="Ttulodelatablauser">
+    <w:name w:val="Título de la tabla (user)"/>
+    <w:basedOn w:val="Contenidodelatablauser"/>
     <w:pPr>
       <w:suppressLineNumbers/>
       <w:jc w:val="center"/>
@@ -7430,8 +7296,8 @@
       <w:bCs/>
     </w:rPr>
   </w:style>
-  <w:style w:type="numbering" w:styleId="Ningunalistauser" w:default="1">
-    <w:name w:val="Ninguna lista (user)"/>
+  <w:style w:type="numbering" w:styleId="Ningunalista" w:default="1">
+    <w:name w:val="Ninguna lista"/>
     <w:uiPriority w:val="99"/>
     <w:semiHidden/>
     <w:unhideWhenUsed/>

</xml_diff>